<commit_message>
docs: add Docker containerization and Vercel serverless instructions to DOCX, PDF, and README
</commit_message>
<xml_diff>
--- a/DOTMappers_AI_Engineer_Assessment_Report.docx
+++ b/DOTMappers_AI_Engineer_Assessment_Report.docx
@@ -95,9 +95,13 @@
               <w:br/>
               <w:t>• Subject Line: [AI Engineer Assessment] — Praveen Kumar</w:t>
               <w:br/>
-              <w:t>• System Execution: python run.py (Starts API &amp; Web UI on http://localhost:8000)</w:t>
+              <w:t>• 1-Command Docker Startup: docker compose up -d (Accessible at http://localhost:8000)</w:t>
               <w:br/>
-              <w:t>• Test Verification: 39 Automated Test Cases Passed (100% Pass Rate in 7.90s)</w:t>
+              <w:t>• Local Python Execution: python run.py (Dev reload) or python run.py --prod --workers 4</w:t>
+              <w:br/>
+              <w:t>• Cloud Serverless: Configured for Vercel deployment via vercel.json &amp; api/index.py</w:t>
+              <w:br/>
+              <w:t>• Test Verification: 39 Automated Test Cases Passed (100% Pass Rate in 9.68s)</w:t>
             </w:r>
           </w:p>
         </w:tc>
@@ -211,6 +215,26 @@
           <w:sz w:val="20"/>
         </w:rPr>
         <w:t xml:space="preserve"> High-throughput REST API with OpenAPI Swagger UI (/docs) and a responsive, dark-mode glassmorphism web console featuring real-time KPI metrics, query console, anomaly scanner, and paginated ticket explorer.</w:t>
+      </w:r>
+    </w:p>
+    <w:p>
+      <w:pPr>
+        <w:spacing w:after="80" w:line="276" w:lineRule="auto"/>
+      </w:pPr>
+      <w:r>
+        <w:rPr>
+          <w:b/>
+          <w:color w:val="1F2937"/>
+          <w:sz w:val="20"/>
+        </w:rPr>
+        <w:t>5. Production Docker &amp; Cloud Serverless:</w:t>
+      </w:r>
+      <w:r>
+        <w:rPr>
+          <w:color w:val="1F2937"/>
+          <w:sz w:val="20"/>
+        </w:rPr>
+        <w:t xml:space="preserve"> Enterprise-hardened with production Dockerfile (non-root resolviq user, security headers, GZip compression), docker-compose.yml with persistent SQLite volume and health checks, and Vercel serverless deployment support via api/index.py.</w:t>
       </w:r>
     </w:p>
     <w:p>
@@ -1870,7 +1894,20 @@
           <w:color w:val="1F2937"/>
           <w:sz w:val="20"/>
         </w:rPr>
-        <w:t>The entire platform can be run and tested by the evaluator using simple, standard commands:</w:t>
+        <w:t>The entire platform can be run and verified by the evaluator using multiple flexible options:</w:t>
+      </w:r>
+    </w:p>
+    <w:p>
+      <w:pPr>
+        <w:spacing w:before="200" w:after="60"/>
+      </w:pPr>
+      <w:r>
+        <w:rPr>
+          <w:b/>
+          <w:color w:val="00897B"/>
+          <w:sz w:val="23"/>
+        </w:rPr>
+        <w:t>Option A: Docker Compose (Recommended 1-Command Startup)</w:t>
       </w:r>
     </w:p>
     <w:p>
@@ -1883,14 +1920,14 @@
           <w:color w:val="1F2937"/>
           <w:sz w:val="20"/>
         </w:rPr>
-        <w:t xml:space="preserve">• Start System: </w:t>
+        <w:t xml:space="preserve">• Run Compose: </w:t>
       </w:r>
       <w:r>
         <w:rPr>
           <w:color w:val="1F2937"/>
           <w:sz w:val="20"/>
         </w:rPr>
-        <w:t>python run.py (Launches FastAPI backend and Web Dashboard at http://localhost:8000)</w:t>
+        <w:t>docker compose up -d (Builds container, mounts persistent data volume, and starts at http://localhost:8000)</w:t>
       </w:r>
     </w:p>
     <w:p>
@@ -1903,14 +1940,140 @@
           <w:color w:val="1F2937"/>
           <w:sz w:val="20"/>
         </w:rPr>
-        <w:t xml:space="preserve">• API Documentation: </w:t>
+        <w:t xml:space="preserve">• Verify Health: </w:t>
       </w:r>
       <w:r>
         <w:rPr>
           <w:color w:val="1F2937"/>
           <w:sz w:val="20"/>
         </w:rPr>
-        <w:t>http://localhost:8000/docs (Explore interactive OpenAPI Swagger catalog)</w:t>
+        <w:t>docker compose ps &amp;&amp; curl http://localhost:8000/health (Confirms container status and telemetry)</w:t>
+      </w:r>
+    </w:p>
+    <w:p>
+      <w:pPr>
+        <w:spacing w:after="80" w:line="276" w:lineRule="auto"/>
+      </w:pPr>
+      <w:r>
+        <w:rPr>
+          <w:b/>
+          <w:color w:val="1F2937"/>
+          <w:sz w:val="20"/>
+        </w:rPr>
+        <w:t xml:space="preserve">• Teardown: </w:t>
+      </w:r>
+      <w:r>
+        <w:rPr>
+          <w:color w:val="1F2937"/>
+          <w:sz w:val="20"/>
+        </w:rPr>
+        <w:t>docker compose down (Gracefully stops all containers)</w:t>
+      </w:r>
+    </w:p>
+    <w:p>
+      <w:pPr>
+        <w:spacing w:before="200" w:after="60"/>
+      </w:pPr>
+      <w:r>
+        <w:rPr>
+          <w:b/>
+          <w:color w:val="00897B"/>
+          <w:sz w:val="23"/>
+        </w:rPr>
+        <w:t>Option B: Docker Single Container</w:t>
+      </w:r>
+    </w:p>
+    <w:p>
+      <w:pPr>
+        <w:spacing w:after="80" w:line="276" w:lineRule="auto"/>
+      </w:pPr>
+      <w:r>
+        <w:rPr>
+          <w:b/>
+          <w:color w:val="1F2937"/>
+          <w:sz w:val="20"/>
+        </w:rPr>
+        <w:t xml:space="preserve">• Build Image: </w:t>
+      </w:r>
+      <w:r>
+        <w:rPr>
+          <w:color w:val="1F2937"/>
+          <w:sz w:val="20"/>
+        </w:rPr>
+        <w:t>docker build -t resolviq-platform:latest .</w:t>
+      </w:r>
+    </w:p>
+    <w:p>
+      <w:pPr>
+        <w:spacing w:after="80" w:line="276" w:lineRule="auto"/>
+      </w:pPr>
+      <w:r>
+        <w:rPr>
+          <w:b/>
+          <w:color w:val="1F2937"/>
+          <w:sz w:val="20"/>
+        </w:rPr>
+        <w:t xml:space="preserve">• Run Container: </w:t>
+      </w:r>
+      <w:r>
+        <w:rPr>
+          <w:color w:val="1F2937"/>
+          <w:sz w:val="20"/>
+        </w:rPr>
+        <w:t>docker run -d --name resolviq -p 8000:8000 -v $(pwd)/data:/app/data resolviq-platform:latest</w:t>
+      </w:r>
+    </w:p>
+    <w:p>
+      <w:pPr>
+        <w:spacing w:before="200" w:after="60"/>
+      </w:pPr>
+      <w:r>
+        <w:rPr>
+          <w:b/>
+          <w:color w:val="00897B"/>
+          <w:sz w:val="23"/>
+        </w:rPr>
+        <w:t>Option C: Native Local Python</w:t>
+      </w:r>
+    </w:p>
+    <w:p>
+      <w:pPr>
+        <w:spacing w:after="80" w:line="276" w:lineRule="auto"/>
+      </w:pPr>
+      <w:r>
+        <w:rPr>
+          <w:b/>
+          <w:color w:val="1F2937"/>
+          <w:sz w:val="20"/>
+        </w:rPr>
+        <w:t xml:space="preserve">• Dev Mode: </w:t>
+      </w:r>
+      <w:r>
+        <w:rPr>
+          <w:color w:val="1F2937"/>
+          <w:sz w:val="20"/>
+        </w:rPr>
+        <w:t>python run.py (Starts with auto-reload at http://localhost:8000)</w:t>
+      </w:r>
+    </w:p>
+    <w:p>
+      <w:pPr>
+        <w:spacing w:after="80" w:line="276" w:lineRule="auto"/>
+      </w:pPr>
+      <w:r>
+        <w:rPr>
+          <w:b/>
+          <w:color w:val="1F2937"/>
+          <w:sz w:val="20"/>
+        </w:rPr>
+        <w:t xml:space="preserve">• Production Mode: </w:t>
+      </w:r>
+      <w:r>
+        <w:rPr>
+          <w:color w:val="1F2937"/>
+          <w:sz w:val="20"/>
+        </w:rPr>
+        <w:t>python run.py --prod --workers 4 (Starts production server with 4 concurrent workers)</w:t>
       </w:r>
     </w:p>
     <w:p>
@@ -1930,7 +2093,40 @@
           <w:color w:val="1F2937"/>
           <w:sz w:val="20"/>
         </w:rPr>
-        <w:t>.venv\Scripts\pytest -v --durations=0 (Runs all 39 automated tests)</w:t>
+        <w:t>.venv\Scripts\pytest -v --durations=0 (Executes all 39 automated Pytest test cases)</w:t>
+      </w:r>
+    </w:p>
+    <w:p>
+      <w:pPr>
+        <w:spacing w:before="200" w:after="60"/>
+      </w:pPr>
+      <w:r>
+        <w:rPr>
+          <w:b/>
+          <w:color w:val="00897B"/>
+          <w:sz w:val="23"/>
+        </w:rPr>
+        <w:t>Option D: Cloud Serverless (Vercel)</w:t>
+      </w:r>
+    </w:p>
+    <w:p>
+      <w:pPr>
+        <w:spacing w:after="80" w:line="276" w:lineRule="auto"/>
+      </w:pPr>
+      <w:r>
+        <w:rPr>
+          <w:b/>
+          <w:color w:val="1F2937"/>
+          <w:sz w:val="20"/>
+        </w:rPr>
+        <w:t xml:space="preserve">• Vercel Deployment: </w:t>
+      </w:r>
+      <w:r>
+        <w:rPr>
+          <w:color w:val="1F2937"/>
+          <w:sz w:val="20"/>
+        </w:rPr>
+        <w:t>Pre-configured for zero-friction serverless deployment via vercel.json and api/index.py, automatically copying and seeding the SQLite database into /tmp/support_tickets.db upon cold start.</w:t>
       </w:r>
     </w:p>
     <w:sectPr>

</xml_diff>

<commit_message>
feat: add responsive design, Groq/Ollama failover, CI/CD and Docker docs, and live Vercel domain
</commit_message>
<xml_diff>
--- a/DOTMappers_AI_Engineer_Assessment_Report.docx
+++ b/DOTMappers_AI_Engineer_Assessment_Report.docx
@@ -32,7 +32,7 @@
     </w:p>
     <w:p>
       <w:pPr>
-        <w:spacing w:after="360"/>
+        <w:spacing w:after="320"/>
         <w:jc w:val="center"/>
       </w:pPr>
       <w:r>
@@ -75,7 +75,7 @@
                 <w:color w:val="00897B"/>
                 <w:sz w:val="20"/>
               </w:rPr>
-              <w:t>SUBMISSION METADATA</w:t>
+              <w:t>SUBMISSION METADATA &amp; SYSTEM SPECIFICATIONS</w:t>
               <w:br/>
             </w:r>
             <w:r>
@@ -85,6 +85,8 @@
               </w:rPr>
               <w:t>• Candidate: Praveen Kumar (praveen-kumar-007)</w:t>
               <w:br/>
+              <w:t>• Live Production URL: https://resolviqai.vercel.app/</w:t>
+              <w:br/>
               <w:t>• Repository: https://github.com/praveen-kumar-007/ResolvIQ---AI-Intelligence-Platform-.git</w:t>
               <w:br/>
               <w:t>• Role: AI Engineer / AI Intern Assessment Submission</w:t>
@@ -93,15 +95,15 @@
               <w:br/>
               <w:t>• Recipient: Mr. Rajath Kumar (HR Lead) | RajathKumar@dotmappers.in</w:t>
               <w:br/>
-              <w:t>• Subject Line: [AI Engineer Assessment] — Praveen Kumar</w:t>
+              <w:t>• CI/CD Pipeline: GitHub Actions matrix testing (Python 3.11 &amp; 3.12) + Docker health checks</w:t>
               <w:br/>
               <w:t>• 1-Command Docker Startup: docker compose up -d (Accessible at http://localhost:8000)</w:t>
               <w:br/>
-              <w:t>• Local Python Execution: python run.py (Dev reload) or python run.py --prod --workers 4</w:t>
+              <w:t>• Multi-Tier LLM: Groq Cloud (llama-3.3-70b) + Ollama Local (qwen2.5 / qwen3) + Token-Limit Failover</w:t>
               <w:br/>
-              <w:t>• Cloud Serverless: Configured for Vercel deployment via vercel.json &amp; api/index.py</w:t>
+              <w:t>• Responsive Web UI: Cross-device glassmorphism dashboard (mobile &lt;=480px, tablet, laptop, desktop)</w:t>
               <w:br/>
-              <w:t>• Test Verification: 39 Automated Test Cases Passed (100% Pass Rate in 9.68s)</w:t>
+              <w:t>• Test Verification: 39 Automated Test Cases Passed (100% Pass Rate)</w:t>
             </w:r>
           </w:p>
         </w:tc>
@@ -154,7 +156,7 @@
           <w:color w:val="1F2937"/>
           <w:sz w:val="20"/>
         </w:rPr>
-        <w:t xml:space="preserve"> Normalizes raw telemetry from support_tickets.csv into a persistent SQLite database with B-Tree indexes across status, priority, category, agent_id, and created_at. Handles null ratings and resolution times accurately.</w:t>
+        <w:t xml:space="preserve"> Normalizes raw telemetry from support_tickets.csv into a persistent SQLite database with B-Tree indexes across status, priority, category, agent_id, and created_at. Accurately handles null ratings and resolution times without synthetic imputation.</w:t>
       </w:r>
     </w:p>
     <w:p>
@@ -174,7 +176,7 @@
           <w:color w:val="1F2937"/>
           <w:sz w:val="20"/>
         </w:rPr>
-        <w:t xml:space="preserve"> Translates arbitrary natural language queries into safe, structured JSON intents (QueryIntent) executed via parameterized SQL, providing complete immunity to SQL injection and zero hallucinations. Integrates multi-tier zero-cost LLMs (Ollama qwen3:8b, Groq llama-3.3-70b free-tier, and sub-5ms deterministic offline fallback).</w:t>
+        <w:t xml:space="preserve"> Translates arbitrary natural language queries into safe, structured JSON intents (QueryIntent) executed via parameterized SQL, providing complete immunity to SQL injection and zero hallucinations. Integrates multi-tier zero-cost LLMs (Groq cloud, Ollama local, and sub-5ms deterministic offline fallback).</w:t>
       </w:r>
     </w:p>
     <w:p>
@@ -234,7 +236,27 @@
           <w:color w:val="1F2937"/>
           <w:sz w:val="20"/>
         </w:rPr>
-        <w:t xml:space="preserve"> Enterprise-hardened with production Dockerfile (non-root resolviq user, security headers, GZip compression), docker-compose.yml with persistent SQLite volume and health checks, and Vercel serverless deployment support via api/index.py.</w:t>
+        <w:t xml:space="preserve"> Enterprise-hardened with production Dockerfile (non-root resolviq user, security headers), docker-compose.yml with persistent SQLite volume and health checks, and Vercel serverless deployment support via api/index.py.</w:t>
+      </w:r>
+    </w:p>
+    <w:p>
+      <w:pPr>
+        <w:spacing w:after="80" w:line="276" w:lineRule="auto"/>
+      </w:pPr>
+      <w:r>
+        <w:rPr>
+          <w:b/>
+          <w:color w:val="1F2937"/>
+          <w:sz w:val="20"/>
+        </w:rPr>
+        <w:t>6. Automated CI/CD Pipeline:</w:t>
+      </w:r>
+      <w:r>
+        <w:rPr>
+          <w:color w:val="1F2937"/>
+          <w:sz w:val="20"/>
+        </w:rPr>
+        <w:t xml:space="preserve"> Automated GitHub Actions workflow (.github/workflows/ci-cd.yml) running matrix Pytest tests on Python 3.11 &amp; 3.12, followed by automated Docker container build and live healthcheck verification.</w:t>
       </w:r>
     </w:p>
     <w:p>
@@ -969,7 +991,7 @@
           <w:color w:val="102A4D"/>
           <w:sz w:val="28"/>
         </w:rPr>
-        <w:t>4. Architecture &amp; System Design Decisions</w:t>
+        <w:t>4. Architecture, Groq/Ollama Failover &amp; CI/CD Design</w:t>
       </w:r>
     </w:p>
     <w:p>
@@ -1007,7 +1029,7 @@
           <w:color w:val="00897B"/>
           <w:sz w:val="23"/>
         </w:rPr>
-        <w:t>Scaling Roadmap to 5,000,000+ Records</w:t>
+        <w:t>Multi-Tier Zero-Cost LLM with Token-Limit Failover</w:t>
       </w:r>
     </w:p>
     <w:p>
@@ -1016,18 +1038,23 @@
       </w:pPr>
       <w:r>
         <w:rPr>
-          <w:b/>
           <w:color w:val="1F2937"/>
           <w:sz w:val="20"/>
         </w:rPr>
-        <w:t>1. Columnar Partitioning:</w:t>
+        <w:t>ResolvIQ integrates Groq Cloud (llama-3.3-70b-versatile) for ultra-fast cloud inference (~100-300ms) and local Ollama (qwen2.5:7b / qwen3:8b) for 100% private, offline execution. When Groq reaches free-tier rate limits (HTTP 429) or token limits (HTTP 413), ResolvIQ automatically falls back to local Ollama (or the deterministic AST engine), surfacing a transparent notice to the user. Evaluators can configure their preferred mode via .env (LLM_PROVIDER=ollama or LLM_PROVIDER=groq).</w:t>
       </w:r>
+    </w:p>
+    <w:p>
+      <w:pPr>
+        <w:spacing w:before="200" w:after="60"/>
+      </w:pPr>
       <w:r>
         <w:rPr>
-          <w:color w:val="1F2937"/>
-          <w:sz w:val="20"/>
+          <w:b/>
+          <w:color w:val="00897B"/>
+          <w:sz w:val="23"/>
         </w:rPr>
-        <w:t xml:space="preserve"> Migrate SQLite to PostgreSQL or ClickHouse with monthly range partitioning on created_at and BRIN indexes for time-series range scans.</w:t>
+        <w:t>Automated CI/CD Pipeline (GitHub Actions)</w:t>
       </w:r>
     </w:p>
     <w:p>
@@ -1036,18 +1063,23 @@
       </w:pPr>
       <w:r>
         <w:rPr>
-          <w:b/>
           <w:color w:val="1F2937"/>
           <w:sz w:val="20"/>
         </w:rPr>
-        <w:t>2. Semantic Query Caching:</w:t>
+        <w:t>The project includes an enterprise-grade CI/CD pipeline (.github/workflows/ci-cd.yml) that executes on every push and pull request. It runs a matrix test across Python 3.11 and 3.12 with full duration profiling (pytest -v --durations=0), followed by an automated Docker build and live healthcheck verification (curl http://localhost:8000/health) before approving the build.</w:t>
       </w:r>
+    </w:p>
+    <w:p>
+      <w:pPr>
+        <w:spacing w:before="200" w:after="60"/>
+      </w:pPr>
       <w:r>
         <w:rPr>
-          <w:color w:val="1F2937"/>
-          <w:sz w:val="20"/>
+          <w:b/>
+          <w:color w:val="00897B"/>
+          <w:sz w:val="23"/>
         </w:rPr>
-        <w:t xml:space="preserve"> Deploy Qdrant or pgvector to cache QueryIntent embeddings; semantically identical questions are resolved in &lt;10ms without hitting LLM inference.</w:t>
+        <w:t>Universal Responsive Design Across All Devices</w:t>
       </w:r>
     </w:p>
     <w:p>
@@ -1056,18 +1088,10 @@
       </w:pPr>
       <w:r>
         <w:rPr>
-          <w:b/>
           <w:color w:val="1F2937"/>
           <w:sz w:val="20"/>
         </w:rPr>
-        <w:t>3. Asynchronous Stream Processing:</w:t>
-      </w:r>
-      <w:r>
-        <w:rPr>
-          <w:color w:val="1F2937"/>
-          <w:sz w:val="20"/>
-        </w:rPr>
-        <w:t xml:space="preserve"> Replace batch ingestion with Kafka stream topics and Celery workers to evaluate anomaly thresholds in real time as tickets arrive.</w:t>
+        <w:t>The Web UI is fully responsive across mobile phones (&lt;=480px), small tablets (&lt;=768px), laptops (&lt;=1024px), and desktop displays (&gt;1024px). Layouts gracefully adapt using modern CSS grid and flexbox, featuring horizontal table scrolling, touch-optimized typography, and fluid KPI cards.</w:t>
       </w:r>
     </w:p>
     <w:p>
@@ -1092,7 +1116,7 @@
           <w:color w:val="1F2937"/>
           <w:sz w:val="20"/>
         </w:rPr>
-        <w:t>The system has been rigorously validated with 39 automated Pytest test cases covering API endpoints, data ingestion, null handling, SQL injection defense, and all Section 9 sample queries. Result: 100% passing in 7.90 seconds.</w:t>
+        <w:t>The system has been rigorously validated with 39 automated Pytest test cases covering API endpoints, data ingestion, null handling, SQL injection defense, and all Section 9 sample queries. Result: 100% passing.</w:t>
       </w:r>
     </w:p>
     <w:tbl>
@@ -2106,7 +2130,7 @@
           <w:color w:val="00897B"/>
           <w:sz w:val="23"/>
         </w:rPr>
-        <w:t>Option D: Cloud Serverless (Vercel)</w:t>
+        <w:t>Option D: Cloud Serverless (Live at https://resolviqai.vercel.app/)</w:t>
       </w:r>
     </w:p>
     <w:p>
@@ -2126,7 +2150,7 @@
           <w:color w:val="1F2937"/>
           <w:sz w:val="20"/>
         </w:rPr>
-        <w:t>Pre-configured for zero-friction serverless deployment via vercel.json and api/index.py, automatically copying and seeding the SQLite database into /tmp/support_tickets.db upon cold start.</w:t>
+        <w:t>Fully live and operational on Vercel at https://resolviqai.vercel.app/ with automated cold-start database seeding into /tmp/support_tickets.db. Evaluators can directly access the interactive dashboard and OpenAPI Swagger docs at https://resolviqai.vercel.app/docs.</w:t>
       </w:r>
     </w:p>
     <w:sectPr>

</xml_diff>